<commit_message>
Add Yale postdoc, close out USC Ph.D. and role, update contact email
Co-Authored-By: Claude Fable 5.1 <noreply@anthropic.com>
Claude-Session: https://claude.ai/code/session_01K4LGGUnR4SGSye5Rr71SEm
</commit_message>
<xml_diff>
--- a/dist/Xinyu_Guo_CV.docx
+++ b/dist/Xinyu_Guo_CV.docx
@@ -51,7 +51,7 @@
           <w:sz w:val="17"/>
           <w:u w:val="none"/>
         </w:rPr>
-        <w:t>xinyug@usc.edu   ·   (314) 680-8961   ·   Open to relocation   ·   xinyuguo.com   ·   github.com/Thewhey-Brian</w:t>
+        <w:t>xinyu.guo@yale.edu   ·   (314) 680-8961   ·   Open to relocation   ·   xinyuguo.com   ·   github.com/Thewhey-Brian</w:t>
       </w:r>
     </w:p>
     <w:p>
@@ -126,7 +126,7 @@
           <w:sz w:val="16"/>
           <w:u w:val="none"/>
         </w:rPr>
-        <w:t>Aug 2022 – 2026</w:t>
+        <w:t>2022 – 2026</w:t>
       </w:r>
     </w:p>
     <w:p>
@@ -257,6 +257,120 @@
           <w:spacing w:val="26"/>
         </w:rPr>
         <w:t>EXPERIENCE</w:t>
+      </w:r>
+    </w:p>
+    <w:p>
+      <w:pPr>
+        <w:tabs>
+          <w:tab w:pos="10512" w:val="right"/>
+        </w:tabs>
+        <w:spacing w:before="140" w:after="0" w:line="326" w:lineRule="auto"/>
+      </w:pPr>
+      <w:r>
+        <w:rPr>
+          <w:rFonts w:ascii="Helvetica Neue" w:hAnsi="Helvetica Neue" w:cs="Helvetica Neue"/>
+          <w:b/>
+          <w:i w:val="0"/>
+          <w:color w:val="14171A"/>
+          <w:sz w:val="19"/>
+          <w:u w:val="none"/>
+        </w:rPr>
+        <w:t xml:space="preserve">Postdoctoral Associate </w:t>
+      </w:r>
+      <w:r>
+        <w:rPr>
+          <w:rFonts w:ascii="Helvetica Neue" w:hAnsi="Helvetica Neue" w:cs="Helvetica Neue"/>
+          <w:b/>
+          <w:i w:val="0"/>
+          <w:color w:val="3A4046"/>
+          <w:sz w:val="19"/>
+          <w:u w:val="none"/>
+        </w:rPr>
+        <w:t>— Yale University</w:t>
+      </w:r>
+      <w:r>
+        <w:tab/>
+      </w:r>
+      <w:r>
+        <w:rPr>
+          <w:rFonts w:ascii="Helvetica Neue" w:hAnsi="Helvetica Neue" w:cs="Helvetica Neue"/>
+          <w:b w:val="0"/>
+          <w:i w:val="0"/>
+          <w:color w:val="717A85"/>
+          <w:sz w:val="16"/>
+          <w:u w:val="none"/>
+        </w:rPr>
+        <w:t>Sep 2026 – Present</w:t>
+      </w:r>
+    </w:p>
+    <w:p>
+      <w:pPr>
+        <w:spacing w:before="10" w:after="0" w:line="326" w:lineRule="auto"/>
+      </w:pPr>
+      <w:r>
+        <w:rPr>
+          <w:rFonts w:ascii="Charter" w:hAnsi="Charter" w:cs="Charter"/>
+          <w:b w:val="0"/>
+          <w:i/>
+          <w:color w:val="717A85"/>
+          <w:sz w:val="17"/>
+          <w:u w:val="none"/>
+        </w:rPr>
+        <w:t>AI for biology &amp; biological foundation models · Advisor: Dr. Lucila Ohno-Machado · New Haven, CT</w:t>
+      </w:r>
+    </w:p>
+    <w:p>
+      <w:pPr>
+        <w:tabs>
+          <w:tab w:pos="245" w:val="left"/>
+        </w:tabs>
+        <w:spacing w:before="68" w:after="0" w:line="326" w:lineRule="auto"/>
+        <w:ind w:left="245" w:hanging="245"/>
+      </w:pPr>
+      <w:r>
+        <w:rPr>
+          <w:rFonts w:ascii="Charter" w:hAnsi="Charter" w:cs="Charter"/>
+          <w:b w:val="0"/>
+          <w:i w:val="0"/>
+          <w:color w:val="A9B1BA"/>
+          <w:sz w:val="18"/>
+          <w:u w:val="none"/>
+        </w:rPr>
+        <w:t>–</w:t>
+        <w:tab/>
+      </w:r>
+      <w:r>
+        <w:rPr>
+          <w:rFonts w:ascii="Charter" w:hAnsi="Charter" w:cs="Charter"/>
+          <w:b w:val="0"/>
+          <w:i w:val="0"/>
+          <w:color w:val="3A4046"/>
+          <w:sz w:val="18"/>
+          <w:u w:val="none"/>
+        </w:rPr>
+        <w:t xml:space="preserve">Develop and evaluate </w:t>
+      </w:r>
+      <w:r>
+        <w:rPr>
+          <w:rFonts w:ascii="Charter" w:hAnsi="Charter" w:cs="Charter"/>
+          <w:b/>
+          <w:i w:val="0"/>
+          <w:color w:val="14171A"/>
+          <w:sz w:val="18"/>
+          <w:u w:val="none"/>
+        </w:rPr>
+        <w:t>biological foundation models</w:t>
+      </w:r>
+      <w:r>
+        <w:rPr>
+          <w:rFonts w:ascii="Charter" w:hAnsi="Charter" w:cs="Charter"/>
+          <w:b w:val="0"/>
+          <w:i w:val="0"/>
+          <w:color w:val="3A4046"/>
+          <w:sz w:val="18"/>
+          <w:u w:val="none"/>
+        </w:rPr>
+        <w:t xml:space="preserve"> spanning DNA, RNA, and single-cell modalities, focusing on how pretrained representations transfer to variant-effect, regulatory, and disease-risk tasks.</w:t>
       </w:r>
     </w:p>
     <w:p>
@@ -598,7 +712,7 @@
           <w:sz w:val="16"/>
           <w:u w:val="none"/>
         </w:rPr>
-        <w:t>Aug 2022 – Present</w:t>
+        <w:t>Aug 2022 – May 2026</w:t>
       </w:r>
     </w:p>
     <w:p>
@@ -809,60 +923,6 @@
           <w:u w:val="none"/>
         </w:rPr>
         <w:t>, linking common regulatory variation to nonsense-mediated mRNA decay and exposing a mechanism by which non-coding variants modulate transcript stability and disease risk.</w:t>
-      </w:r>
-    </w:p>
-    <w:p>
-      <w:pPr>
-        <w:tabs>
-          <w:tab w:pos="245" w:val="left"/>
-        </w:tabs>
-        <w:spacing w:before="68" w:after="0" w:line="326" w:lineRule="auto"/>
-        <w:ind w:left="245" w:hanging="245"/>
-      </w:pPr>
-      <w:r>
-        <w:rPr>
-          <w:rFonts w:ascii="Charter" w:hAnsi="Charter" w:cs="Charter"/>
-          <w:b w:val="0"/>
-          <w:i w:val="0"/>
-          <w:color w:val="A9B1BA"/>
-          <w:sz w:val="18"/>
-          <w:u w:val="none"/>
-        </w:rPr>
-        <w:t>–</w:t>
-        <w:tab/>
-      </w:r>
-      <w:r>
-        <w:rPr>
-          <w:rFonts w:ascii="Charter" w:hAnsi="Charter" w:cs="Charter"/>
-          <w:b w:val="0"/>
-          <w:i w:val="0"/>
-          <w:color w:val="3A4046"/>
-          <w:sz w:val="18"/>
-          <w:u w:val="none"/>
-        </w:rPr>
-        <w:t xml:space="preserve">Designed a </w:t>
-      </w:r>
-      <w:r>
-        <w:rPr>
-          <w:rFonts w:ascii="Charter" w:hAnsi="Charter" w:cs="Charter"/>
-          <w:b/>
-          <w:i w:val="0"/>
-          <w:color w:val="14171A"/>
-          <w:sz w:val="18"/>
-          <w:u w:val="none"/>
-        </w:rPr>
-        <w:t>cross-dataset benchmark</w:t>
-      </w:r>
-      <w:r>
-        <w:rPr>
-          <w:rFonts w:ascii="Charter" w:hAnsi="Charter" w:cs="Charter"/>
-          <w:b w:val="0"/>
-          <w:i w:val="0"/>
-          <w:color w:val="3A4046"/>
-          <w:sz w:val="18"/>
-          <w:u w:val="none"/>
-        </w:rPr>
-        <w:t xml:space="preserve"> for cell-cycle phase inference from single-cell RNA-seq, defining the evaluation protocol and the failure modes that separate methods which generalize from those that do not.</w:t>
       </w:r>
     </w:p>
     <w:p>
@@ -2499,7 +2559,7 @@
           <w:sz w:val="18"/>
           <w:u w:val="none"/>
         </w:rPr>
-        <w:t>Python · R · C++ · SQL · Bash · TypeScript · PyTorch (DDP/FSDP), PyTorch Geometric, Hugging Face, JAX, scikit-learn, CUDA · FastAPI · React · Nextflow / WDL · DuckDB, Parquet · Docker, Git</w:t>
+        <w:t>Python · R · C++ · SQL · Bash · TypeScript · PyTorch (DDP/FSDP), PyG, Hugging Face, JAX, scikit-learn, CUDA · FastAPI · React · Nextflow / WDL · DuckDB · Docker, Git</w:t>
       </w:r>
     </w:p>
     <w:p>
@@ -2527,7 +2587,7 @@
           <w:sz w:val="18"/>
           <w:u w:val="none"/>
         </w:rPr>
-        <w:t>AWS SageMaker GPU inference · Bedrock · HealthOmics · EC2, ECS, S3 · petabyte-scale sequence data on Linux/HPC · multi-GPU (A100) distributed training</w:t>
+        <w:t>AWS (SageMaker, Bedrock, HealthOmics, EC2/ECS/S3) · petabyte-scale data on HPC · multi-GPU training</w:t>
       </w:r>
     </w:p>
     <w:sectPr>

</xml_diff>

<commit_message>
Retarget CV toward ML/foundation-model roles; add Yale projects
Co-Authored-By: Claude Opus 5.5 <noreply@anthropic.com>
</commit_message>
<xml_diff>
--- a/dist/Xinyu_Guo_CV.docx
+++ b/dist/Xinyu_Guo_CV.docx
@@ -32,7 +32,7 @@
           <w:u w:val="none"/>
           <w:spacing w:val="13"/>
         </w:rPr>
-        <w:t>GENOMIC FOUNDATION MODELS  ·  CANCER GENOMICS  ·  SCIENTIFIC AI AGENTS</w:t>
+        <w:t>FOUNDATION MODELS  ·  GENERATIVE MODELING  ·  AI FOR SCIENCE</w:t>
       </w:r>
     </w:p>
     <w:p>
@@ -316,7 +316,7 @@
           <w:sz w:val="17"/>
           <w:u w:val="none"/>
         </w:rPr>
-        <w:t>AI for biology &amp; biological foundation models · Advisor: Dr. Lucila Ohno-Machado · New Haven, CT</w:t>
+        <w:t>Foundation models &amp; generative modeling · Advisor: Dr. Lucila Ohno-Machado · New Haven, CT</w:t>
       </w:r>
     </w:p>
     <w:p>
@@ -348,7 +348,7 @@
           <w:sz w:val="18"/>
           <w:u w:val="none"/>
         </w:rPr>
-        <w:t xml:space="preserve">Develop and evaluate </w:t>
+        <w:t xml:space="preserve">Develop and train </w:t>
       </w:r>
       <w:r>
         <w:rPr>
@@ -359,7 +359,7 @@
           <w:sz w:val="18"/>
           <w:u w:val="none"/>
         </w:rPr>
-        <w:t>biological foundation models</w:t>
+        <w:t>generative flow-matching and diffusion models</w:t>
       </w:r>
       <w:r>
         <w:rPr>
@@ -370,7 +370,115 @@
           <w:sz w:val="18"/>
           <w:u w:val="none"/>
         </w:rPr>
-        <w:t xml:space="preserve"> spanning DNA, RNA, and single-cell modalities, focusing on how pretrained representations transfer to variant-effect, regulatory, and disease-risk tasks.</w:t>
+        <w:t xml:space="preserve"> that forecast how high-dimensional cell populations evolve over time; evaluate generalization to held-out time points and conditions.</w:t>
+      </w:r>
+    </w:p>
+    <w:p>
+      <w:pPr>
+        <w:tabs>
+          <w:tab w:pos="245" w:val="left"/>
+        </w:tabs>
+        <w:spacing w:before="68" w:after="0" w:line="326" w:lineRule="auto"/>
+        <w:ind w:left="245" w:hanging="245"/>
+      </w:pPr>
+      <w:r>
+        <w:rPr>
+          <w:rFonts w:ascii="Charter" w:hAnsi="Charter" w:cs="Charter"/>
+          <w:b w:val="0"/>
+          <w:i w:val="0"/>
+          <w:color w:val="A9B1BA"/>
+          <w:sz w:val="18"/>
+          <w:u w:val="none"/>
+        </w:rPr>
+        <w:t>–</w:t>
+        <w:tab/>
+      </w:r>
+      <w:r>
+        <w:rPr>
+          <w:rFonts w:ascii="Charter" w:hAnsi="Charter" w:cs="Charter"/>
+          <w:b w:val="0"/>
+          <w:i w:val="0"/>
+          <w:color w:val="3A4046"/>
+          <w:sz w:val="18"/>
+          <w:u w:val="none"/>
+        </w:rPr>
+        <w:t xml:space="preserve">Fine-tune and evaluate </w:t>
+      </w:r>
+      <w:r>
+        <w:rPr>
+          <w:rFonts w:ascii="Charter" w:hAnsi="Charter" w:cs="Charter"/>
+          <w:b/>
+          <w:i w:val="0"/>
+          <w:color w:val="14171A"/>
+          <w:sz w:val="18"/>
+          <w:u w:val="none"/>
+        </w:rPr>
+        <w:t>sequence foundation models</w:t>
+      </w:r>
+      <w:r>
+        <w:rPr>
+          <w:rFonts w:ascii="Charter" w:hAnsi="Charter" w:cs="Charter"/>
+          <w:b w:val="0"/>
+          <w:i w:val="0"/>
+          <w:color w:val="3A4046"/>
+          <w:sz w:val="18"/>
+          <w:u w:val="none"/>
+        </w:rPr>
+        <w:t xml:space="preserve"> on long-context genomic data, including parameter-efficient (LoRA) adaptation and multi-GPU training on a Slurm cluster.</w:t>
+      </w:r>
+    </w:p>
+    <w:p>
+      <w:pPr>
+        <w:tabs>
+          <w:tab w:pos="245" w:val="left"/>
+        </w:tabs>
+        <w:spacing w:before="68" w:after="0" w:line="326" w:lineRule="auto"/>
+        <w:ind w:left="245" w:hanging="245"/>
+      </w:pPr>
+      <w:r>
+        <w:rPr>
+          <w:rFonts w:ascii="Charter" w:hAnsi="Charter" w:cs="Charter"/>
+          <w:b w:val="0"/>
+          <w:i w:val="0"/>
+          <w:color w:val="A9B1BA"/>
+          <w:sz w:val="18"/>
+          <w:u w:val="none"/>
+        </w:rPr>
+        <w:t>–</w:t>
+        <w:tab/>
+      </w:r>
+      <w:r>
+        <w:rPr>
+          <w:rFonts w:ascii="Charter" w:hAnsi="Charter" w:cs="Charter"/>
+          <w:b w:val="0"/>
+          <w:i w:val="0"/>
+          <w:color w:val="3A4046"/>
+          <w:sz w:val="18"/>
+          <w:u w:val="none"/>
+        </w:rPr>
+        <w:t xml:space="preserve">Build </w:t>
+      </w:r>
+      <w:r>
+        <w:rPr>
+          <w:rFonts w:ascii="Charter" w:hAnsi="Charter" w:cs="Charter"/>
+          <w:b/>
+          <w:i w:val="0"/>
+          <w:color w:val="14171A"/>
+          <w:sz w:val="18"/>
+          <w:u w:val="none"/>
+        </w:rPr>
+        <w:t>perturbation-response prediction models</w:t>
+      </w:r>
+      <w:r>
+        <w:rPr>
+          <w:rFonts w:ascii="Charter" w:hAnsi="Charter" w:cs="Charter"/>
+          <w:b w:val="0"/>
+          <w:i w:val="0"/>
+          <w:color w:val="3A4046"/>
+          <w:sz w:val="18"/>
+          <w:u w:val="none"/>
+        </w:rPr>
+        <w:t xml:space="preserve"> for the Arc Institute Virtual Cell Challenge 2026; design leakage-safe, held-out-context benchmarks to measure out-of-distribution generalization.</w:t>
       </w:r>
     </w:p>
     <w:p>
@@ -462,7 +570,7 @@
           <w:sz w:val="18"/>
           <w:u w:val="none"/>
         </w:rPr>
-        <w:t xml:space="preserve">Researched DNA foundation models, particularly sequence-to-function models such as AlphaGenome and Enigma. Studied these state-of-the-art models against an OncoExTra tumor cohort, </w:t>
+        <w:t xml:space="preserve">Evaluated sequence-to-function foundation models (AlphaGenome, Enigma) on an OncoExTra tumor cohort, expanding the reviewable evidence space by </w:t>
       </w:r>
       <w:r>
         <w:rPr>
@@ -473,7 +581,7 @@
           <w:sz w:val="18"/>
           <w:u w:val="none"/>
         </w:rPr>
-        <w:t>rescuing 2,554 of 6,087 variants (42%)</w:t>
+        <w:t>2,554 of 6,087 variants (42%)</w:t>
       </w:r>
       <w:r>
         <w:rPr>
@@ -484,7 +592,7 @@
           <w:sz w:val="18"/>
           <w:u w:val="none"/>
         </w:rPr>
-        <w:t xml:space="preserve"> that conventional snpEff annotation had deprioritized.</w:t>
+        <w:t xml:space="preserve"> that snpEff had deprioritized.</w:t>
       </w:r>
     </w:p>
     <w:p>
@@ -538,7 +646,7 @@
           <w:sz w:val="18"/>
           <w:u w:val="none"/>
         </w:rPr>
-        <w:t xml:space="preserve">, a scientific agent that translates natural-language research requests into executable Enigma, Evo2, and Carbon workflows, automating sequence-context construction, batch embeddings, feature extraction, model routing, and provenance across </w:t>
+        <w:t xml:space="preserve">, an agent that turns natural-language requests into Enigma, Evo2, and Carbon workflows across </w:t>
       </w:r>
       <w:r>
         <w:rPr>
@@ -560,7 +668,7 @@
           <w:sz w:val="18"/>
           <w:u w:val="none"/>
         </w:rPr>
-        <w:t>, through to downstream modeling with task-specific classification heads.</w:t>
+        <w:t>, from sequence construction through task-specific heads.</w:t>
       </w:r>
     </w:p>
     <w:p>
@@ -592,7 +700,7 @@
           <w:sz w:val="18"/>
           <w:u w:val="none"/>
         </w:rPr>
-        <w:t xml:space="preserve">Built FFPE artifact-risk detection models over ~140 GB of paired fresh-frozen and FFPE sequencing data and evaluated them head-to-head against three published tools on a common cohort, reaching </w:t>
+        <w:t xml:space="preserve">Trained FFPE artifact-risk models on ~140 GB of paired fresh-frozen/FFPE sequencing, reaching </w:t>
       </w:r>
       <w:r>
         <w:rPr>
@@ -614,7 +722,7 @@
           <w:sz w:val="18"/>
           <w:u w:val="none"/>
         </w:rPr>
-        <w:t xml:space="preserve"> against 0.677 (FFPErase), 0.517 (FFPolish), and 0.509 (FIFA).</w:t>
+        <w:t xml:space="preserve"> versus evaluated implementations of FFPErase (0.677), FFPolish (0.517), and FIFA (0.509) on the same cohort.</w:t>
       </w:r>
     </w:p>
     <w:p>
@@ -646,7 +754,7 @@
           <w:sz w:val="18"/>
           <w:u w:val="none"/>
         </w:rPr>
-        <w:t>Trained multiple-instance learning models on UNI2-h pathology foundation model embeddings over 2,099 whole-slide images from 1,485 patients, predicting ER (</w:t>
+        <w:t>Trained multiple-instance models on UNI2-h pathology embeddings over 2,099 whole-slide images, predicting ER (</w:t>
       </w:r>
       <w:r>
         <w:rPr>
@@ -668,7 +776,7 @@
           <w:sz w:val="18"/>
           <w:u w:val="none"/>
         </w:rPr>
-        <w:t>), TNBC (0.893), and HRD-high (0.790) from H&amp;E under 5-fold × 3-repeat cross-validation, with every leave-institution-out drop ≤ 0.03; benchmarked gated-attention against mean-pooling aggregation to settle where the added complexity pays.</w:t>
+        <w:t>), TNBC (0.893), and HRD-high (0.790) with every leave-institution-out drop ≤ 0.03.</w:t>
       </w:r>
     </w:p>
     <w:p>
@@ -728,7 +836,7 @@
           <w:sz w:val="17"/>
           <w:u w:val="none"/>
         </w:rPr>
-        <w:t>Biological pathology AI/ML modeling · Advisor: Dr. Liang Chen</w:t>
+        <w:t>Multi-modal representation learning · Advisor: Dr. Liang Chen</w:t>
       </w:r>
     </w:p>
     <w:p>
@@ -782,7 +890,7 @@
           <w:sz w:val="18"/>
           <w:u w:val="none"/>
         </w:rPr>
-        <w:t xml:space="preserve"> integrating DNA sequence, RNA expression, and spatial transcriptomics to identify tissue-specific disease-risk regions, built around explainability so individual genetic variants map to interpretable spatial microenvironments.</w:t>
+        <w:t xml:space="preserve"> integrating DNA sequence, RNA expression, and spatial data, built for interpretability so individual inputs map to explainable spatial structure.</w:t>
       </w:r>
     </w:p>
     <w:p>
@@ -814,7 +922,7 @@
           <w:sz w:val="18"/>
           <w:u w:val="none"/>
         </w:rPr>
-        <w:t xml:space="preserve">Designed a </w:t>
+        <w:t xml:space="preserve">Designed </w:t>
       </w:r>
       <w:r>
         <w:rPr>
@@ -825,7 +933,7 @@
           <w:sz w:val="18"/>
           <w:u w:val="none"/>
         </w:rPr>
-        <w:t>self-supervised contrastive learning</w:t>
+        <w:t>self-supervised contrastive</w:t>
       </w:r>
       <w:r>
         <w:rPr>
@@ -836,39 +944,7 @@
           <w:sz w:val="18"/>
           <w:u w:val="none"/>
         </w:rPr>
-        <w:t xml:space="preserve"> method with GNN/GAT architectures for spatial transcriptomics, enabling integration with large-scale multi-omics cohorts across scRNA-seq, scATAC-seq, and spatial modalities for genetic risk evaluation.</w:t>
-      </w:r>
-    </w:p>
-    <w:p>
-      <w:pPr>
-        <w:tabs>
-          <w:tab w:pos="245" w:val="left"/>
-        </w:tabs>
-        <w:spacing w:before="68" w:after="0" w:line="326" w:lineRule="auto"/>
-        <w:ind w:left="245" w:hanging="245"/>
-      </w:pPr>
-      <w:r>
-        <w:rPr>
-          <w:rFonts w:ascii="Charter" w:hAnsi="Charter" w:cs="Charter"/>
-          <w:b w:val="0"/>
-          <w:i w:val="0"/>
-          <w:color w:val="A9B1BA"/>
-          <w:sz w:val="18"/>
-          <w:u w:val="none"/>
-        </w:rPr>
-        <w:t>–</w:t>
-        <w:tab/>
-      </w:r>
-      <w:r>
-        <w:rPr>
-          <w:rFonts w:ascii="Charter" w:hAnsi="Charter" w:cs="Charter"/>
-          <w:b w:val="0"/>
-          <w:i w:val="0"/>
-          <w:color w:val="3A4046"/>
-          <w:sz w:val="18"/>
-          <w:u w:val="none"/>
-        </w:rPr>
-        <w:t>Proposed a fusion architecture using weighted message-passing GNNs and attention to project GWAS/TWAS signals into spatial embeddings, bridging population-scale genetics with tissue-resolved measurement.</w:t>
+        <w:t xml:space="preserve"> GNN/GAT models with attention-based fusion to align population-scale genetic signals with spatial embeddings across single-cell modalities.</w:t>
       </w:r>
     </w:p>
     <w:p>
@@ -922,7 +998,7 @@
           <w:sz w:val="18"/>
           <w:u w:val="none"/>
         </w:rPr>
-        <w:t>, linking common regulatory variation to nonsense-mediated mRNA decay and exposing a mechanism by which non-coding variants modulate transcript stability and disease risk.</w:t>
+        <w:t>, linking regulatory variation to nonsense-mediated mRNA decay and transcript stability.</w:t>
       </w:r>
     </w:p>
     <w:p>
@@ -1036,7 +1112,7 @@
           <w:sz w:val="18"/>
           <w:u w:val="none"/>
         </w:rPr>
-        <w:t>, a subset-based cross-tissue meta-analysis method for transcriptome-wide association studies that raises power over standard single- and multi-tissue tests while identifying which tissues are actually "active" for a gene–trait signal, improving both power and interpretability.</w:t>
+        <w:t>, a subset-based cross-tissue TWAS method that raises power over single- and multi-tissue tests while identifying which tissues drive each gene–trait signal.</w:t>
       </w:r>
     </w:p>
     <w:p>
@@ -1068,7 +1144,7 @@
           <w:sz w:val="18"/>
           <w:u w:val="none"/>
         </w:rPr>
-        <w:t xml:space="preserve">Performed transcriptome- and proteome-wide association studies at bulk and single-cell resolution to identify genes linked to </w:t>
+        <w:t xml:space="preserve">Ran transcriptome- and proteome-wide association studies at bulk and single-cell resolution, identifying genes linked to </w:t>
       </w:r>
       <w:r>
         <w:rPr>
@@ -1090,39 +1166,7 @@
           <w:sz w:val="18"/>
           <w:u w:val="none"/>
         </w:rPr>
-        <w:t>, and contributed to follow-on work partitioning polygenic risk scores to identify cancer-related proteins.</w:t>
-      </w:r>
-    </w:p>
-    <w:p>
-      <w:pPr>
-        <w:tabs>
-          <w:tab w:pos="245" w:val="left"/>
-        </w:tabs>
-        <w:spacing w:before="68" w:after="0" w:line="326" w:lineRule="auto"/>
-        <w:ind w:left="245" w:hanging="245"/>
-      </w:pPr>
-      <w:r>
-        <w:rPr>
-          <w:rFonts w:ascii="Charter" w:hAnsi="Charter" w:cs="Charter"/>
-          <w:b w:val="0"/>
-          <w:i w:val="0"/>
-          <w:color w:val="A9B1BA"/>
-          <w:sz w:val="18"/>
-          <w:u w:val="none"/>
-        </w:rPr>
-        <w:t>–</w:t>
-        <w:tab/>
-      </w:r>
-      <w:r>
-        <w:rPr>
-          <w:rFonts w:ascii="Charter" w:hAnsi="Charter" w:cs="Charter"/>
-          <w:b w:val="0"/>
-          <w:i w:val="0"/>
-          <w:color w:val="3A4046"/>
-          <w:sz w:val="18"/>
-          <w:u w:val="none"/>
-        </w:rPr>
-        <w:t>Modeled GWAS summary statistics jointly with single-cell ATAC-seq to interpret disease etiology at cellular rather than tissue resolution.</w:t>
+        <w:t>.</w:t>
       </w:r>
     </w:p>
     <w:p>
@@ -1214,7 +1258,7 @@
           <w:sz w:val="18"/>
           <w:u w:val="none"/>
         </w:rPr>
-        <w:t xml:space="preserve">Built a comprehensive </w:t>
+        <w:t xml:space="preserve">Built the lab's shared </w:t>
       </w:r>
       <w:r>
         <w:rPr>
@@ -1236,39 +1280,7 @@
           <w:sz w:val="18"/>
           <w:u w:val="none"/>
         </w:rPr>
-        <w:t xml:space="preserve"> supporting differential analysis, gene-set enrichment, and motif discovery, which became shared infrastructure across several lab projects.</w:t>
-      </w:r>
-    </w:p>
-    <w:p>
-      <w:pPr>
-        <w:tabs>
-          <w:tab w:pos="245" w:val="left"/>
-        </w:tabs>
-        <w:spacing w:before="68" w:after="0" w:line="326" w:lineRule="auto"/>
-        <w:ind w:left="245" w:hanging="245"/>
-      </w:pPr>
-      <w:r>
-        <w:rPr>
-          <w:rFonts w:ascii="Charter" w:hAnsi="Charter" w:cs="Charter"/>
-          <w:b w:val="0"/>
-          <w:i w:val="0"/>
-          <w:color w:val="A9B1BA"/>
-          <w:sz w:val="18"/>
-          <w:u w:val="none"/>
-        </w:rPr>
-        <w:t>–</w:t>
-        <w:tab/>
-      </w:r>
-      <w:r>
-        <w:rPr>
-          <w:rFonts w:ascii="Charter" w:hAnsi="Charter" w:cs="Charter"/>
-          <w:b w:val="0"/>
-          <w:i w:val="0"/>
-          <w:color w:val="3A4046"/>
-          <w:sz w:val="18"/>
-          <w:u w:val="none"/>
-        </w:rPr>
-        <w:t xml:space="preserve">Elucidated how transcriptional and epigenetic regulators mediate hormone-driven tumor resistance to therapeutics, with the chromatin modifier </w:t>
+        <w:t xml:space="preserve"> and used it to show how the chromatin modifier </w:t>
       </w:r>
       <w:r>
         <w:rPr>
@@ -1290,7 +1302,7 @@
           <w:sz w:val="18"/>
           <w:u w:val="none"/>
         </w:rPr>
-        <w:t xml:space="preserve"> and its methylation by SMYD2 as the central axis.</w:t>
+        <w:t xml:space="preserve"> and its methylation by SMYD2 mediate hormone-driven therapy resistance.</w:t>
       </w:r>
     </w:p>
     <w:p>
@@ -1382,7 +1394,7 @@
           <w:sz w:val="18"/>
           <w:u w:val="none"/>
         </w:rPr>
-        <w:t xml:space="preserve">Shipped Lasso and logistic-regression models predicting respiratory failure in COVID-19 patients </w:t>
+        <w:t xml:space="preserve">Shipped respiratory-failure prediction models for COVID-19 patients </w:t>
       </w:r>
       <w:r>
         <w:rPr>
@@ -1404,7 +1416,7 @@
           <w:sz w:val="18"/>
           <w:u w:val="none"/>
         </w:rPr>
-        <w:t>, where they ran against live patient data during the pandemic peak to flag high-risk patients for ICU triage under acute bed and ventilator constraints.</w:t>
+        <w:t>, running on live patient data to support ICU triage.</w:t>
       </w:r>
     </w:p>
     <w:p>
@@ -1425,6 +1437,278 @@
           <w:spacing w:val="26"/>
         </w:rPr>
         <w:t>SELECTED PROJECTS</w:t>
+      </w:r>
+    </w:p>
+    <w:p>
+      <w:pPr>
+        <w:tabs>
+          <w:tab w:pos="245" w:val="left"/>
+        </w:tabs>
+        <w:spacing w:before="68" w:after="0" w:line="326" w:lineRule="auto"/>
+        <w:ind w:left="245" w:hanging="245"/>
+      </w:pPr>
+      <w:r>
+        <w:rPr>
+          <w:rFonts w:ascii="Charter" w:hAnsi="Charter" w:cs="Charter"/>
+          <w:b w:val="0"/>
+          <w:i w:val="0"/>
+          <w:color w:val="A9B1BA"/>
+          <w:sz w:val="18"/>
+          <w:u w:val="none"/>
+        </w:rPr>
+        <w:t>–</w:t>
+        <w:tab/>
+      </w:r>
+      <w:r>
+        <w:rPr>
+          <w:rFonts w:ascii="Charter" w:hAnsi="Charter" w:cs="Charter"/>
+          <w:b w:val="0"/>
+          <w:i w:val="0"/>
+          <w:color w:val="3A4046"/>
+          <w:sz w:val="18"/>
+          <w:u w:val="none"/>
+        </w:rPr>
+        <w:t xml:space="preserve">Trained a </w:t>
+      </w:r>
+      <w:r>
+        <w:rPr>
+          <w:rFonts w:ascii="Charter" w:hAnsi="Charter" w:cs="Charter"/>
+          <w:b/>
+          <w:i w:val="0"/>
+          <w:color w:val="14171A"/>
+          <w:sz w:val="18"/>
+          <w:u w:val="none"/>
+        </w:rPr>
+        <w:t>560M-parameter decoder-only LLM from scratch</w:t>
+      </w:r>
+      <w:r>
+        <w:rPr>
+          <w:rFonts w:ascii="Charter" w:hAnsi="Charter" w:cs="Charter"/>
+          <w:b w:val="0"/>
+          <w:i w:val="0"/>
+          <w:color w:val="3A4046"/>
+          <w:sz w:val="18"/>
+          <w:u w:val="none"/>
+        </w:rPr>
+        <w:t xml:space="preserve"> </w:t>
+      </w:r>
+      <w:r>
+        <w:rPr>
+          <w:rFonts w:ascii="Charter" w:hAnsi="Charter" w:cs="Charter"/>
+          <w:b w:val="0"/>
+          <w:i/>
+          <w:color w:val="3A4046"/>
+          <w:sz w:val="18"/>
+          <w:u w:val="none"/>
+        </w:rPr>
+        <w:t xml:space="preserve">2025 · </w:t>
+      </w:r>
+      <w:r>
+        <w:rPr>
+          <w:rFonts w:ascii="Charter" w:hAnsi="Charter" w:cs="Charter"/>
+          <w:b w:val="0"/>
+          <w:i/>
+          <w:color w:val="3A4046"/>
+          <w:sz w:val="18"/>
+          <w:u w:val="none"/>
+        </w:rPr>
+        <w:t>xinyuguo.com/projects/nanochat-llm-training</w:t>
+      </w:r>
+      <w:r>
+        <w:rPr>
+          <w:rFonts w:ascii="Charter" w:hAnsi="Charter" w:cs="Charter"/>
+          <w:b w:val="0"/>
+          <w:i w:val="0"/>
+          <w:color w:val="3A4046"/>
+          <w:sz w:val="18"/>
+          <w:u w:val="none"/>
+        </w:rPr>
+        <w:t xml:space="preserve"> — Rust BPE tokenizer, pretraining, supervised fine-tuning, and reinforcement learning with PyTorch DDP across 8 GPUs; evaluated on CORE, ARC, MMLU, GSM8K, and HumanEval.</w:t>
+      </w:r>
+    </w:p>
+    <w:p>
+      <w:pPr>
+        <w:tabs>
+          <w:tab w:pos="245" w:val="left"/>
+        </w:tabs>
+        <w:spacing w:before="68" w:after="0" w:line="326" w:lineRule="auto"/>
+        <w:ind w:left="245" w:hanging="245"/>
+      </w:pPr>
+      <w:r>
+        <w:rPr>
+          <w:rFonts w:ascii="Charter" w:hAnsi="Charter" w:cs="Charter"/>
+          <w:b w:val="0"/>
+          <w:i w:val="0"/>
+          <w:color w:val="A9B1BA"/>
+          <w:sz w:val="18"/>
+          <w:u w:val="none"/>
+        </w:rPr>
+        <w:t>–</w:t>
+        <w:tab/>
+      </w:r>
+      <w:r>
+        <w:rPr>
+          <w:rFonts w:ascii="Charter" w:hAnsi="Charter" w:cs="Charter"/>
+          <w:b w:val="0"/>
+          <w:i w:val="0"/>
+          <w:color w:val="3A4046"/>
+          <w:sz w:val="18"/>
+          <w:u w:val="none"/>
+        </w:rPr>
+        <w:t xml:space="preserve">State-space sequence models </w:t>
+      </w:r>
+      <w:r>
+        <w:rPr>
+          <w:rFonts w:ascii="Charter" w:hAnsi="Charter" w:cs="Charter"/>
+          <w:b w:val="0"/>
+          <w:i/>
+          <w:color w:val="3A4046"/>
+          <w:sz w:val="18"/>
+          <w:u w:val="none"/>
+        </w:rPr>
+        <w:t>2025 – 2026 · lead developer</w:t>
+      </w:r>
+      <w:r>
+        <w:rPr>
+          <w:rFonts w:ascii="Charter" w:hAnsi="Charter" w:cs="Charter"/>
+          <w:b w:val="0"/>
+          <w:i w:val="0"/>
+          <w:color w:val="3A4046"/>
+          <w:sz w:val="18"/>
+          <w:u w:val="none"/>
+        </w:rPr>
+        <w:t xml:space="preserve"> — </w:t>
+      </w:r>
+      <w:r>
+        <w:rPr>
+          <w:rFonts w:ascii="Charter" w:hAnsi="Charter" w:cs="Charter"/>
+          <w:b/>
+          <w:i w:val="0"/>
+          <w:color w:val="14171A"/>
+          <w:sz w:val="18"/>
+          <w:u w:val="none"/>
+        </w:rPr>
+        <w:t>TAL-Mamba</w:t>
+      </w:r>
+      <w:r>
+        <w:rPr>
+          <w:rFonts w:ascii="Charter" w:hAnsi="Charter" w:cs="Charter"/>
+          <w:b w:val="0"/>
+          <w:i w:val="0"/>
+          <w:color w:val="3A4046"/>
+          <w:sz w:val="18"/>
+          <w:u w:val="none"/>
+        </w:rPr>
+        <w:t xml:space="preserve">, temporal action localization over 2+ hour sequences at 68% less memory than Transformer baselines; </w:t>
+      </w:r>
+      <w:r>
+        <w:rPr>
+          <w:rFonts w:ascii="Charter" w:hAnsi="Charter" w:cs="Charter"/>
+          <w:b/>
+          <w:i w:val="0"/>
+          <w:color w:val="14171A"/>
+          <w:sz w:val="18"/>
+          <w:u w:val="none"/>
+        </w:rPr>
+        <w:t>Track Mamba</w:t>
+      </w:r>
+      <w:r>
+        <w:rPr>
+          <w:rFonts w:ascii="Charter" w:hAnsi="Charter" w:cs="Charter"/>
+          <w:b w:val="0"/>
+          <w:i w:val="0"/>
+          <w:color w:val="3A4046"/>
+          <w:sz w:val="18"/>
+          <w:u w:val="none"/>
+        </w:rPr>
+        <w:t>, a linear-complexity real-time small-object tracker 40% smaller and 50% faster than TrackNet baselines.</w:t>
+      </w:r>
+    </w:p>
+    <w:p>
+      <w:pPr>
+        <w:tabs>
+          <w:tab w:pos="245" w:val="left"/>
+        </w:tabs>
+        <w:spacing w:before="68" w:after="0" w:line="326" w:lineRule="auto"/>
+        <w:ind w:left="245" w:hanging="245"/>
+      </w:pPr>
+      <w:r>
+        <w:rPr>
+          <w:rFonts w:ascii="Charter" w:hAnsi="Charter" w:cs="Charter"/>
+          <w:b w:val="0"/>
+          <w:i w:val="0"/>
+          <w:color w:val="A9B1BA"/>
+          <w:sz w:val="18"/>
+          <w:u w:val="none"/>
+        </w:rPr>
+        <w:t>–</w:t>
+        <w:tab/>
+      </w:r>
+      <w:r>
+        <w:rPr>
+          <w:rFonts w:ascii="Charter" w:hAnsi="Charter" w:cs="Charter"/>
+          <w:b/>
+          <w:i w:val="0"/>
+          <w:color w:val="14171A"/>
+          <w:sz w:val="18"/>
+          <w:u w:val="none"/>
+        </w:rPr>
+        <w:t>Legal Patent Copilot</w:t>
+      </w:r>
+      <w:r>
+        <w:rPr>
+          <w:rFonts w:ascii="Charter" w:hAnsi="Charter" w:cs="Charter"/>
+          <w:b w:val="0"/>
+          <w:i w:val="0"/>
+          <w:color w:val="3A4046"/>
+          <w:sz w:val="18"/>
+          <w:u w:val="none"/>
+        </w:rPr>
+        <w:t xml:space="preserve"> </w:t>
+      </w:r>
+      <w:r>
+        <w:rPr>
+          <w:rFonts w:ascii="Charter" w:hAnsi="Charter" w:cs="Charter"/>
+          <w:b w:val="0"/>
+          <w:i/>
+          <w:color w:val="3A4046"/>
+          <w:sz w:val="18"/>
+          <w:u w:val="none"/>
+        </w:rPr>
+        <w:t>2024</w:t>
+      </w:r>
+      <w:r>
+        <w:rPr>
+          <w:rFonts w:ascii="Charter" w:hAnsi="Charter" w:cs="Charter"/>
+          <w:b w:val="0"/>
+          <w:i w:val="0"/>
+          <w:color w:val="3A4046"/>
+          <w:sz w:val="18"/>
+          <w:u w:val="none"/>
+        </w:rPr>
+        <w:t xml:space="preserve"> — retrieval agent for prior-art discovery over 10M+ documents using FAISS indexing and fine-tuned reranking layers, cutting search latency </w:t>
+      </w:r>
+      <w:r>
+        <w:rPr>
+          <w:rFonts w:ascii="Charter" w:hAnsi="Charter" w:cs="Charter"/>
+          <w:b/>
+          <w:i w:val="0"/>
+          <w:color w:val="14171A"/>
+          <w:sz w:val="18"/>
+          <w:u w:val="none"/>
+        </w:rPr>
+        <w:t>42%</w:t>
+      </w:r>
+      <w:r>
+        <w:rPr>
+          <w:rFonts w:ascii="Charter" w:hAnsi="Charter" w:cs="Charter"/>
+          <w:b w:val="0"/>
+          <w:i w:val="0"/>
+          <w:color w:val="3A4046"/>
+          <w:sz w:val="18"/>
+          <w:u w:val="none"/>
+        </w:rPr>
+        <w:t xml:space="preserve"> with improved recall.</w:t>
       </w:r>
     </w:p>
     <w:p>
@@ -1506,350 +1790,12 @@
         <w:rPr>
           <w:rFonts w:ascii="Charter" w:hAnsi="Charter" w:cs="Charter"/>
           <w:b w:val="0"/>
-          <w:i/>
-          <w:color w:val="3A4046"/>
-          <w:sz w:val="18"/>
-          <w:u w:val="none"/>
-        </w:rPr>
-        <w:t xml:space="preserve"> — scored sequence-model predictions on 858 gene–tissue pairs and 10,120 fine-mapped variant–gene–tissue triplets across 10 GTEx tissues; chromatin tracks enriched for causal variants (ATAC 1.18×, P &lt; 10⁻⁴) while expression predictions held only 55–60% sign accuracy, mapping where sequence models can and cannot substitute for genotype-trained methods.</w:t>
-      </w:r>
-    </w:p>
-    <w:p>
-      <w:pPr>
-        <w:tabs>
-          <w:tab w:pos="245" w:val="left"/>
-        </w:tabs>
-        <w:spacing w:before="68" w:after="0" w:line="326" w:lineRule="auto"/>
-        <w:ind w:left="245" w:hanging="245"/>
-      </w:pPr>
-      <w:r>
-        <w:rPr>
-          <w:rFonts w:ascii="Charter" w:hAnsi="Charter" w:cs="Charter"/>
-          <w:b w:val="0"/>
-          <w:i w:val="0"/>
-          <w:color w:val="A9B1BA"/>
-          <w:sz w:val="18"/>
-          <w:u w:val="none"/>
-        </w:rPr>
-        <w:t>–</w:t>
-        <w:tab/>
-      </w:r>
-      <w:r>
-        <w:rPr>
-          <w:rFonts w:ascii="Charter" w:hAnsi="Charter" w:cs="Charter"/>
-          <w:b w:val="0"/>
           <w:i w:val="0"/>
           <w:color w:val="3A4046"/>
           <w:sz w:val="18"/>
           <w:u w:val="none"/>
         </w:rPr>
-        <w:t xml:space="preserve">Trained a </w:t>
-      </w:r>
-      <w:r>
-        <w:rPr>
-          <w:rFonts w:ascii="Charter" w:hAnsi="Charter" w:cs="Charter"/>
-          <w:b/>
-          <w:i w:val="0"/>
-          <w:color w:val="14171A"/>
-          <w:sz w:val="18"/>
-          <w:u w:val="none"/>
-        </w:rPr>
-        <w:t>560M-parameter decoder-only LLM from scratch</w:t>
-      </w:r>
-      <w:r>
-        <w:rPr>
-          <w:rFonts w:ascii="Charter" w:hAnsi="Charter" w:cs="Charter"/>
-          <w:b w:val="0"/>
-          <w:i w:val="0"/>
-          <w:color w:val="3A4046"/>
-          <w:sz w:val="18"/>
-          <w:u w:val="none"/>
-        </w:rPr>
-        <w:t xml:space="preserve"> </w:t>
-      </w:r>
-      <w:r>
-        <w:rPr>
-          <w:rFonts w:ascii="Charter" w:hAnsi="Charter" w:cs="Charter"/>
-          <w:b w:val="0"/>
-          <w:i/>
-          <w:color w:val="3A4046"/>
-          <w:sz w:val="18"/>
-          <w:u w:val="none"/>
-        </w:rPr>
-        <w:t xml:space="preserve">2025 · </w:t>
-      </w:r>
-      <w:r>
-        <w:rPr>
-          <w:rFonts w:ascii="Charter" w:hAnsi="Charter" w:cs="Charter"/>
-          <w:b w:val="0"/>
-          <w:i/>
-          <w:color w:val="3A4046"/>
-          <w:sz w:val="18"/>
-          <w:u w:val="none"/>
-        </w:rPr>
-        <w:t>xinyuguo.com/projects/nanochat-llm-training</w:t>
-      </w:r>
-      <w:r>
-        <w:rPr>
-          <w:rFonts w:ascii="Charter" w:hAnsi="Charter" w:cs="Charter"/>
-          <w:b w:val="0"/>
-          <w:i/>
-          <w:color w:val="3A4046"/>
-          <w:sz w:val="18"/>
-          <w:u w:val="none"/>
-        </w:rPr>
-        <w:t xml:space="preserve"> — built the full pipeline end to end: Rust BPE tokenizer, data loading, base </w:t>
-      </w:r>
-      <w:r>
-        <w:rPr>
-          <w:rFonts w:ascii="Charter" w:hAnsi="Charter" w:cs="Charter"/>
-          <w:b/>
-          <w:i/>
-          <w:color w:val="14171A"/>
-          <w:sz w:val="18"/>
-          <w:u w:val="none"/>
-        </w:rPr>
-        <w:t>pretraining</w:t>
-      </w:r>
-      <w:r>
-        <w:rPr>
-          <w:rFonts w:ascii="Charter" w:hAnsi="Charter" w:cs="Charter"/>
-          <w:b w:val="0"/>
-          <w:i/>
-          <w:color w:val="3A4046"/>
-          <w:sz w:val="18"/>
-          <w:u w:val="none"/>
-        </w:rPr>
-        <w:t xml:space="preserve">, midtraining, </w:t>
-      </w:r>
-      <w:r>
-        <w:rPr>
-          <w:rFonts w:ascii="Charter" w:hAnsi="Charter" w:cs="Charter"/>
-          <w:b/>
-          <w:i/>
-          <w:color w:val="14171A"/>
-          <w:sz w:val="18"/>
-          <w:u w:val="none"/>
-        </w:rPr>
-        <w:t>supervised fine-tuning</w:t>
-      </w:r>
-      <w:r>
-        <w:rPr>
-          <w:rFonts w:ascii="Charter" w:hAnsi="Charter" w:cs="Charter"/>
-          <w:b w:val="0"/>
-          <w:i/>
-          <w:color w:val="3A4046"/>
-          <w:sz w:val="18"/>
-          <w:u w:val="none"/>
-        </w:rPr>
-        <w:t xml:space="preserve">, and </w:t>
-      </w:r>
-      <w:r>
-        <w:rPr>
-          <w:rFonts w:ascii="Charter" w:hAnsi="Charter" w:cs="Charter"/>
-          <w:b/>
-          <w:i/>
-          <w:color w:val="14171A"/>
-          <w:sz w:val="18"/>
-          <w:u w:val="none"/>
-        </w:rPr>
-        <w:t>reinforcement learning</w:t>
-      </w:r>
-      <w:r>
-        <w:rPr>
-          <w:rFonts w:ascii="Charter" w:hAnsi="Charter" w:cs="Charter"/>
-          <w:b w:val="0"/>
-          <w:i/>
-          <w:color w:val="3A4046"/>
-          <w:sz w:val="18"/>
-          <w:u w:val="none"/>
-        </w:rPr>
-        <w:t>, with distributed PyTorch DDP across 8 GPUs, mixed precision, and gradient-synchronization tuning for cluster throughput; evaluated on CORE, ARC, MMLU, GSM8K, and HumanEval.</w:t>
-      </w:r>
-    </w:p>
-    <w:p>
-      <w:pPr>
-        <w:tabs>
-          <w:tab w:pos="245" w:val="left"/>
-        </w:tabs>
-        <w:spacing w:before="68" w:after="0" w:line="326" w:lineRule="auto"/>
-        <w:ind w:left="245" w:hanging="245"/>
-      </w:pPr>
-      <w:r>
-        <w:rPr>
-          <w:rFonts w:ascii="Charter" w:hAnsi="Charter" w:cs="Charter"/>
-          <w:b w:val="0"/>
-          <w:i w:val="0"/>
-          <w:color w:val="A9B1BA"/>
-          <w:sz w:val="18"/>
-          <w:u w:val="none"/>
-        </w:rPr>
-        <w:t>–</w:t>
-        <w:tab/>
-      </w:r>
-      <w:r>
-        <w:rPr>
-          <w:rFonts w:ascii="Charter" w:hAnsi="Charter" w:cs="Charter"/>
-          <w:b w:val="0"/>
-          <w:i w:val="0"/>
-          <w:color w:val="3A4046"/>
-          <w:sz w:val="18"/>
-          <w:u w:val="none"/>
-        </w:rPr>
-        <w:t xml:space="preserve">State-space sequence models for long-horizon and edge deployment </w:t>
-      </w:r>
-      <w:r>
-        <w:rPr>
-          <w:rFonts w:ascii="Charter" w:hAnsi="Charter" w:cs="Charter"/>
-          <w:b w:val="0"/>
-          <w:i/>
-          <w:color w:val="3A4046"/>
-          <w:sz w:val="18"/>
-          <w:u w:val="none"/>
-        </w:rPr>
-        <w:t>2025 – 2026 · lead developer / principal architect</w:t>
-      </w:r>
-      <w:r>
-        <w:rPr>
-          <w:rFonts w:ascii="Charter" w:hAnsi="Charter" w:cs="Charter"/>
-          <w:b w:val="0"/>
-          <w:i/>
-          <w:color w:val="3A4046"/>
-          <w:sz w:val="18"/>
-          <w:u w:val="none"/>
-        </w:rPr>
-        <w:t xml:space="preserve"> — </w:t>
-      </w:r>
-      <w:r>
-        <w:rPr>
-          <w:rFonts w:ascii="Charter" w:hAnsi="Charter" w:cs="Charter"/>
-          <w:b/>
-          <w:i/>
-          <w:color w:val="14171A"/>
-          <w:sz w:val="18"/>
-          <w:u w:val="none"/>
-        </w:rPr>
-        <w:t>TAL-Mamba</w:t>
-      </w:r>
-      <w:r>
-        <w:rPr>
-          <w:rFonts w:ascii="Charter" w:hAnsi="Charter" w:cs="Charter"/>
-          <w:b w:val="0"/>
-          <w:i/>
-          <w:color w:val="3A4046"/>
-          <w:sz w:val="18"/>
-          <w:u w:val="none"/>
-        </w:rPr>
-        <w:t xml:space="preserve">, temporal action localization over 2+ hour sequences with efficient state management, cutting memory 68% versus Transformer baselines; and </w:t>
-      </w:r>
-      <w:r>
-        <w:rPr>
-          <w:rFonts w:ascii="Charter" w:hAnsi="Charter" w:cs="Charter"/>
-          <w:b/>
-          <w:i/>
-          <w:color w:val="14171A"/>
-          <w:sz w:val="18"/>
-          <w:u w:val="none"/>
-        </w:rPr>
-        <w:t>Track Mamba</w:t>
-      </w:r>
-      <w:r>
-        <w:rPr>
-          <w:rFonts w:ascii="Charter" w:hAnsi="Charter" w:cs="Charter"/>
-          <w:b w:val="0"/>
-          <w:i/>
-          <w:color w:val="3A4046"/>
-          <w:sz w:val="18"/>
-          <w:u w:val="none"/>
-        </w:rPr>
-        <w:t>, a linear-complexity real-time small-object tracker 40% smaller and 50% faster than TrackNet baselines at higher precision–recall.</w:t>
-      </w:r>
-    </w:p>
-    <w:p>
-      <w:pPr>
-        <w:tabs>
-          <w:tab w:pos="245" w:val="left"/>
-        </w:tabs>
-        <w:spacing w:before="68" w:after="0" w:line="326" w:lineRule="auto"/>
-        <w:ind w:left="245" w:hanging="245"/>
-      </w:pPr>
-      <w:r>
-        <w:rPr>
-          <w:rFonts w:ascii="Charter" w:hAnsi="Charter" w:cs="Charter"/>
-          <w:b w:val="0"/>
-          <w:i w:val="0"/>
-          <w:color w:val="A9B1BA"/>
-          <w:sz w:val="18"/>
-          <w:u w:val="none"/>
-        </w:rPr>
-        <w:t>–</w:t>
-        <w:tab/>
-      </w:r>
-      <w:r>
-        <w:rPr>
-          <w:rFonts w:ascii="Charter" w:hAnsi="Charter" w:cs="Charter"/>
-          <w:b/>
-          <w:i w:val="0"/>
-          <w:color w:val="14171A"/>
-          <w:sz w:val="18"/>
-          <w:u w:val="none"/>
-        </w:rPr>
-        <w:t>Legal Patent Copilot</w:t>
-      </w:r>
-      <w:r>
-        <w:rPr>
-          <w:rFonts w:ascii="Charter" w:hAnsi="Charter" w:cs="Charter"/>
-          <w:b w:val="0"/>
-          <w:i w:val="0"/>
-          <w:color w:val="3A4046"/>
-          <w:sz w:val="18"/>
-          <w:u w:val="none"/>
-        </w:rPr>
-        <w:t xml:space="preserve"> </w:t>
-      </w:r>
-      <w:r>
-        <w:rPr>
-          <w:rFonts w:ascii="Charter" w:hAnsi="Charter" w:cs="Charter"/>
-          <w:b w:val="0"/>
-          <w:i/>
-          <w:color w:val="3A4046"/>
-          <w:sz w:val="18"/>
-          <w:u w:val="none"/>
-        </w:rPr>
-        <w:t>2024</w:t>
-      </w:r>
-      <w:r>
-        <w:rPr>
-          <w:rFonts w:ascii="Charter" w:hAnsi="Charter" w:cs="Charter"/>
-          <w:b w:val="0"/>
-          <w:i/>
-          <w:color w:val="3A4046"/>
-          <w:sz w:val="18"/>
-          <w:u w:val="none"/>
-        </w:rPr>
-        <w:t xml:space="preserve"> — retrieval agent for prior-art discovery over 10M+ documents using FAISS indexing and fine-tuned reranking layers, cutting search latency </w:t>
-      </w:r>
-      <w:r>
-        <w:rPr>
-          <w:rFonts w:ascii="Charter" w:hAnsi="Charter" w:cs="Charter"/>
-          <w:b/>
-          <w:i/>
-          <w:color w:val="14171A"/>
-          <w:sz w:val="18"/>
-          <w:u w:val="none"/>
-        </w:rPr>
-        <w:t>42%</w:t>
-      </w:r>
-      <w:r>
-        <w:rPr>
-          <w:rFonts w:ascii="Charter" w:hAnsi="Charter" w:cs="Charter"/>
-          <w:b w:val="0"/>
-          <w:i/>
-          <w:color w:val="3A4046"/>
-          <w:sz w:val="18"/>
-          <w:u w:val="none"/>
-        </w:rPr>
-        <w:t xml:space="preserve"> with improved recall.</w:t>
+        <w:t xml:space="preserve"> — 10,120 fine-mapped variant–gene–tissue triplets across 10 GTEx tissues; chromatin tracks enriched for causal variants (ATAC 1.18×, P &lt; 10⁻⁴) while expression predictions held only 55–60% sign accuracy.</w:t>
       </w:r>
     </w:p>
     <w:p>
@@ -1910,7 +1856,7 @@
           <w:i w:val="0"/>
           <w:color w:val="3A4046"/>
           <w:sz w:val="17"/>
-          <w:u w:val="single"/>
+          <w:u w:val="none"/>
         </w:rPr>
         <w:t xml:space="preserve">, Chen, L. From G1 to M: a comparative study of methods for identifying cell cycle phases. </w:t>
       </w:r>
@@ -1921,7 +1867,7 @@
           <w:i/>
           <w:color w:val="3A4046"/>
           <w:sz w:val="17"/>
-          <w:u w:val="single"/>
+          <w:u w:val="none"/>
         </w:rPr>
         <w:t>Briefings in Bioinformatics</w:t>
       </w:r>
@@ -1929,10 +1875,10 @@
         <w:rPr>
           <w:rFonts w:ascii="Charter" w:hAnsi="Charter" w:cs="Charter"/>
           <w:b w:val="0"/>
-          <w:i/>
+          <w:i w:val="0"/>
           <w:color w:val="3A4046"/>
           <w:sz w:val="17"/>
-          <w:u w:val="single"/>
+          <w:u w:val="none"/>
         </w:rPr>
         <w:t xml:space="preserve"> (2024).</w:t>
       </w:r>
@@ -1975,7 +1921,7 @@
           <w:i w:val="0"/>
           <w:color w:val="3A4046"/>
           <w:sz w:val="17"/>
-          <w:u w:val="single"/>
+          <w:u w:val="none"/>
         </w:rPr>
         <w:t xml:space="preserve">, Chatterjee, N., Dutta, D. Subset-based method for cross-tissue transcriptome-wide association studies improves power and interpretability. </w:t>
       </w:r>
@@ -1986,7 +1932,7 @@
           <w:i/>
           <w:color w:val="3A4046"/>
           <w:sz w:val="17"/>
-          <w:u w:val="single"/>
+          <w:u w:val="none"/>
         </w:rPr>
         <w:t>Human Genetics and Genomics Advances</w:t>
       </w:r>
@@ -1994,10 +1940,10 @@
         <w:rPr>
           <w:rFonts w:ascii="Charter" w:hAnsi="Charter" w:cs="Charter"/>
           <w:b w:val="0"/>
-          <w:i/>
+          <w:i w:val="0"/>
           <w:color w:val="3A4046"/>
           <w:sz w:val="17"/>
-          <w:u w:val="single"/>
+          <w:u w:val="none"/>
         </w:rPr>
         <w:t xml:space="preserve"> (2024).</w:t>
       </w:r>
@@ -2051,7 +1997,7 @@
           <w:i w:val="0"/>
           <w:color w:val="3A4046"/>
           <w:sz w:val="17"/>
-          <w:u w:val="single"/>
+          <w:u w:val="none"/>
         </w:rPr>
         <w:t xml:space="preserve">, Winter, T.D., et al. Transcriptome- and proteome-wide association studies identify genes associated with renal cell carcinoma. </w:t>
       </w:r>
@@ -2062,7 +2008,7 @@
           <w:i/>
           <w:color w:val="3A4046"/>
           <w:sz w:val="17"/>
-          <w:u w:val="single"/>
+          <w:u w:val="none"/>
         </w:rPr>
         <w:t>The American Journal of Human Genetics</w:t>
       </w:r>
@@ -2070,10 +2016,10 @@
         <w:rPr>
           <w:rFonts w:ascii="Charter" w:hAnsi="Charter" w:cs="Charter"/>
           <w:b w:val="0"/>
-          <w:i/>
+          <w:i w:val="0"/>
           <w:color w:val="3A4046"/>
           <w:sz w:val="17"/>
-          <w:u w:val="single"/>
+          <w:u w:val="none"/>
         </w:rPr>
         <w:t xml:space="preserve"> (2024).</w:t>
       </w:r>
@@ -2127,7 +2073,7 @@
           <w:i w:val="0"/>
           <w:color w:val="3A4046"/>
           <w:sz w:val="17"/>
-          <w:u w:val="single"/>
+          <w:u w:val="none"/>
         </w:rPr>
         <w:t xml:space="preserve">, et al. Cell-autonomous Cxcl1 sustains tolerogenic circuitries and stromal inflammation via neutrophil-derived TNF in pancreatic cancer. </w:t>
       </w:r>
@@ -2138,7 +2084,7 @@
           <w:i/>
           <w:color w:val="3A4046"/>
           <w:sz w:val="17"/>
-          <w:u w:val="single"/>
+          <w:u w:val="none"/>
         </w:rPr>
         <w:t>Cancer Discovery</w:t>
       </w:r>
@@ -2146,10 +2092,10 @@
         <w:rPr>
           <w:rFonts w:ascii="Charter" w:hAnsi="Charter" w:cs="Charter"/>
           <w:b w:val="0"/>
-          <w:i/>
+          <w:i w:val="0"/>
           <w:color w:val="3A4046"/>
           <w:sz w:val="17"/>
-          <w:u w:val="single"/>
+          <w:u w:val="none"/>
         </w:rPr>
         <w:t xml:space="preserve"> (2023).</w:t>
       </w:r>
@@ -2203,7 +2149,7 @@
           <w:i w:val="0"/>
           <w:color w:val="3A4046"/>
           <w:sz w:val="17"/>
-          <w:u w:val="single"/>
+          <w:u w:val="none"/>
         </w:rPr>
         <w:t xml:space="preserve">, et al. Methylation of the chromatin modifier KMT2D by SMYD2 contributes to therapeutic response in hormone-dependent breast cancer. </w:t>
       </w:r>
@@ -2214,7 +2160,7 @@
           <w:i/>
           <w:color w:val="3A4046"/>
           <w:sz w:val="17"/>
-          <w:u w:val="single"/>
+          <w:u w:val="none"/>
         </w:rPr>
         <w:t>Cell Reports</w:t>
       </w:r>
@@ -2222,10 +2168,10 @@
         <w:rPr>
           <w:rFonts w:ascii="Charter" w:hAnsi="Charter" w:cs="Charter"/>
           <w:b w:val="0"/>
-          <w:i/>
+          <w:i w:val="0"/>
           <w:color w:val="3A4046"/>
           <w:sz w:val="17"/>
-          <w:u w:val="single"/>
+          <w:u w:val="none"/>
         </w:rPr>
         <w:t xml:space="preserve"> (2024).</w:t>
       </w:r>
@@ -2279,7 +2225,7 @@
           <w:i w:val="0"/>
           <w:color w:val="3A4046"/>
           <w:sz w:val="17"/>
-          <w:u w:val="single"/>
+          <w:u w:val="none"/>
         </w:rPr>
         <w:t xml:space="preserve">, et al. The histone methyltransferase KMT2D mediates subtype-specific transcriptional regulation, lineage plasticity, and therapeutic response in castration-resistant prostate cancer. </w:t>
       </w:r>
@@ -2290,7 +2236,7 @@
           <w:i/>
           <w:color w:val="3A4046"/>
           <w:sz w:val="17"/>
-          <w:u w:val="single"/>
+          <w:u w:val="none"/>
         </w:rPr>
         <w:t>Cancer Research</w:t>
       </w:r>
@@ -2298,10 +2244,10 @@
         <w:rPr>
           <w:rFonts w:ascii="Charter" w:hAnsi="Charter" w:cs="Charter"/>
           <w:b w:val="0"/>
-          <w:i/>
+          <w:i w:val="0"/>
           <w:color w:val="3A4046"/>
           <w:sz w:val="17"/>
-          <w:u w:val="single"/>
+          <w:u w:val="none"/>
         </w:rPr>
         <w:t xml:space="preserve"> (2024, 2025).</w:t>
       </w:r>
@@ -2355,7 +2301,7 @@
           <w:i w:val="0"/>
           <w:color w:val="3A4046"/>
           <w:sz w:val="17"/>
-          <w:u w:val="single"/>
+          <w:u w:val="none"/>
         </w:rPr>
         <w:t xml:space="preserve">, et al. ERK hyperactivation as a unified mechanism of escape in intrinsic and acquired CDK4/6-inhibitor resistance in acral lentiginous melanoma. </w:t>
       </w:r>
@@ -2366,7 +2312,7 @@
           <w:i/>
           <w:color w:val="3A4046"/>
           <w:sz w:val="17"/>
-          <w:u w:val="single"/>
+          <w:u w:val="none"/>
         </w:rPr>
         <w:t>Oncogene</w:t>
       </w:r>
@@ -2374,10 +2320,10 @@
         <w:rPr>
           <w:rFonts w:ascii="Charter" w:hAnsi="Charter" w:cs="Charter"/>
           <w:b w:val="0"/>
-          <w:i/>
+          <w:i w:val="0"/>
           <w:color w:val="3A4046"/>
           <w:sz w:val="17"/>
-          <w:u w:val="single"/>
+          <w:u w:val="none"/>
         </w:rPr>
         <w:t xml:space="preserve"> (2024).</w:t>
       </w:r>
@@ -2431,7 +2377,7 @@
           <w:i w:val="0"/>
           <w:color w:val="3A4046"/>
           <w:sz w:val="17"/>
-          <w:u w:val="single"/>
+          <w:u w:val="none"/>
         </w:rPr>
         <w:t xml:space="preserve">, et al. Leveraging and partitioning polygenic risk scores to identify cancer-related proteins. </w:t>
       </w:r>
@@ -2442,7 +2388,7 @@
           <w:i/>
           <w:color w:val="3A4046"/>
           <w:sz w:val="17"/>
-          <w:u w:val="single"/>
+          <w:u w:val="none"/>
         </w:rPr>
         <w:t>medRxiv</w:t>
       </w:r>
@@ -2450,10 +2396,10 @@
         <w:rPr>
           <w:rFonts w:ascii="Charter" w:hAnsi="Charter" w:cs="Charter"/>
           <w:b w:val="0"/>
-          <w:i/>
+          <w:i w:val="0"/>
           <w:color w:val="3A4046"/>
           <w:sz w:val="17"/>
-          <w:u w:val="single"/>
+          <w:u w:val="none"/>
         </w:rPr>
         <w:t xml:space="preserve"> (2025, preprint).</w:t>
       </w:r>
@@ -2492,7 +2438,7 @@
           <w:u w:val="none"/>
           <w:spacing w:val="8"/>
         </w:rPr>
-        <w:t xml:space="preserve">AI / ML  </w:t>
+        <w:t xml:space="preserve">ML RESEARCH  </w:t>
       </w:r>
       <w:r>
         <w:rPr>
@@ -2503,35 +2449,7 @@
           <w:sz w:val="18"/>
           <w:u w:val="none"/>
         </w:rPr>
-        <w:t>Genomic foundation models (AlphaGenome, Enigma, Evo2, Carbon, Borzoi, Enformer, DNABERT) · transformers · state-space models (Mamba) · GNN/GAT · self-supervised &amp; contrastive learning · LLM pretraining · agentic systems &amp; tool use · RAG / vector retrieval · benchmark design &amp; leakage-safe evaluation</w:t>
-      </w:r>
-    </w:p>
-    <w:p>
-      <w:pPr>
-        <w:spacing w:before="68" w:after="0" w:line="326" w:lineRule="auto"/>
-      </w:pPr>
-      <w:r>
-        <w:rPr>
-          <w:rFonts w:ascii="Helvetica Neue" w:hAnsi="Helvetica Neue" w:cs="Helvetica Neue"/>
-          <w:b/>
-          <w:i w:val="0"/>
-          <w:color w:val="7A1F2B"/>
-          <w:sz w:val="15"/>
-          <w:u w:val="none"/>
-          <w:spacing w:val="8"/>
-        </w:rPr>
-        <w:t xml:space="preserve">COMP. BIOLOGY  </w:t>
-      </w:r>
-      <w:r>
-        <w:rPr>
-          <w:rFonts w:ascii="Charter" w:hAnsi="Charter" w:cs="Charter"/>
-          <w:b w:val="0"/>
-          <w:i w:val="0"/>
-          <w:color w:val="3A4046"/>
-          <w:sz w:val="18"/>
-          <w:u w:val="none"/>
-        </w:rPr>
-        <w:t>Cancer genomics &amp; precision oncology · variant-effect prediction (SNV, SV, fusion) · regulatory genomics &amp; splicing · GWAS/TWAS · single-cell and spatial transcriptomics · RNA-seq / ChIP-seq / ATAC-seq · NGS somatic calling, FFPE artifacts, VCF · Ensembl, NCBI, UniProt, PDB, OncoKB, CIViC</w:t>
+        <w:t>Foundation-model pretraining &amp; fine-tuning (LoRA / full) · generative models (flow matching, diffusion, autoregressive LLMs) · transformers, state-space models (Mamba), GNNs · self-supervised &amp; contrastive learning · reinforcement learning · agentic systems &amp; tool use · RAG / vector retrieval · benchmark design &amp; leakage-safe evaluation</w:t>
       </w:r>
     </w:p>
     <w:p>
@@ -2559,7 +2477,7 @@
           <w:sz w:val="18"/>
           <w:u w:val="none"/>
         </w:rPr>
-        <w:t>Python · R · C++ · SQL · Bash · TypeScript · PyTorch (DDP/FSDP), PyG, Hugging Face, JAX, scikit-learn, CUDA · FastAPI · React · Nextflow / WDL · DuckDB · Docker, Git</w:t>
+        <w:t>Python · C++ · SQL · Bash · TypeScript · R · PyTorch (DDP/FSDP) · JAX · Hugging Face · PyG · CUDA · distributed multi-GPU training on Slurm HPC and AWS (SageMaker, Bedrock, EC2, S3) · FastAPI · Docker · Git</w:t>
       </w:r>
     </w:p>
     <w:p>
@@ -2576,7 +2494,7 @@
           <w:u w:val="none"/>
           <w:spacing w:val="8"/>
         </w:rPr>
-        <w:t xml:space="preserve">CLOUD / SCALE  </w:t>
+        <w:t xml:space="preserve">AI FOR SCIENCE  </w:t>
       </w:r>
       <w:r>
         <w:rPr>
@@ -2587,7 +2505,7 @@
           <w:sz w:val="18"/>
           <w:u w:val="none"/>
         </w:rPr>
-        <w:t>AWS (SageMaker, Bedrock, HealthOmics, EC2/ECS/S3) · petabyte-scale data on HPC · multi-GPU training</w:t>
+        <w:t>Genomic, single-cell, and pathology foundation models (AlphaGenome, Enigma, Evo 2, Borzoi, Enformer, scGPT, Geneformer, UNI) · variant-effect prediction · single-cell &amp; spatial omics · statistical genetics</w:t>
       </w:r>
     </w:p>
     <w:sectPr>

</xml_diff>